<commit_message>
docs: v2.0 — regenerate all three manuals to current reality
Architecture, User and Operation manuals (plus decks and diagrams)
updated from the stale 1 Aug v1.0: 12 pages + contact.php, the copy
overhaul and positioning, service detail pages, four blog articles,
the services cost estimator with its quote-to-contact flow, the
context-carrying CTAs, the apps.p3mai.com front door (six apps), the
contact-mail pipeline operations, the corrected publish allow-list
(now includes service pages, articles, contact.php and the tile
icons), and the CDN cache-busting discipline including the
never-probe-pre-deploy rule.

Co-Authored-By: Claude Fable 5 <noreply@anthropic.com>
</commit_message>
<xml_diff>
--- a/docs/01_Architecture_and_Design.docx
+++ b/docs/01_Architecture_and_Design.docx
@@ -165,7 +165,7 @@
                 <w:color w:val="1C2B3A"/>
                 <w:sz w:val="22"/>
               </w:rPr>
-              <w:t>v1.0</w:t>
+              <w:t>v2.0</w:t>
             </w:r>
           </w:p>
         </w:tc>
@@ -201,7 +201,7 @@
                 <w:color w:val="1C2B3A"/>
                 <w:sz w:val="22"/>
               </w:rPr>
-              <w:t>1 August 2026</w:t>
+              <w:t>6 August 2026</w:t>
             </w:r>
           </w:p>
         </w:tc>
@@ -492,6 +492,76 @@
           </w:p>
         </w:tc>
       </w:tr>
+      <w:tr>
+        <w:tc>
+          <w:tcPr>
+            <w:tcW w:type="dxa" w:w="2353"/>
+          </w:tcPr>
+          <w:p>
+            <w:r>
+              <w:rPr>
+                <w:rFonts w:ascii="Segoe UI" w:hAnsi="Segoe UI" w:cs="Segoe UI"/>
+                <w:b w:val="0"/>
+                <w:i w:val="0"/>
+                <w:color w:val="1C2B3A"/>
+                <w:sz w:val="20"/>
+              </w:rPr>
+              <w:t>v2.0</w:t>
+            </w:r>
+          </w:p>
+        </w:tc>
+        <w:tc>
+          <w:tcPr>
+            <w:tcW w:type="dxa" w:w="2353"/>
+          </w:tcPr>
+          <w:p>
+            <w:r>
+              <w:rPr>
+                <w:rFonts w:ascii="Segoe UI" w:hAnsi="Segoe UI" w:cs="Segoe UI"/>
+                <w:b w:val="0"/>
+                <w:i w:val="0"/>
+                <w:color w:val="1C2B3A"/>
+                <w:sz w:val="20"/>
+              </w:rPr>
+              <w:t>2026-08-06</w:t>
+            </w:r>
+          </w:p>
+        </w:tc>
+        <w:tc>
+          <w:tcPr>
+            <w:tcW w:type="dxa" w:w="2353"/>
+          </w:tcPr>
+          <w:p>
+            <w:r>
+              <w:rPr>
+                <w:rFonts w:ascii="Segoe UI" w:hAnsi="Segoe UI" w:cs="Segoe UI"/>
+                <w:b w:val="0"/>
+                <w:i w:val="0"/>
+                <w:color w:val="1C2B3A"/>
+                <w:sz w:val="20"/>
+              </w:rPr>
+              <w:t>Douglas Colvin</w:t>
+            </w:r>
+          </w:p>
+        </w:tc>
+        <w:tc>
+          <w:tcPr>
+            <w:tcW w:type="dxa" w:w="2353"/>
+          </w:tcPr>
+          <w:p>
+            <w:r>
+              <w:rPr>
+                <w:rFonts w:ascii="Segoe UI" w:hAnsi="Segoe UI" w:cs="Segoe UI"/>
+                <w:b w:val="0"/>
+                <w:i w:val="0"/>
+                <w:color w:val="1C2B3A"/>
+                <w:sz w:val="20"/>
+              </w:rPr>
+              <w:t>Copy overhaul + service pages + articles + services estimator + contact mail pipeline + apps front door; site is 12 pages + one PHP endpoint</w:t>
+            </w:r>
+          </w:p>
+        </w:tc>
+      </w:tr>
     </w:tbl>
     <w:p/>
     <w:p>
@@ -581,7 +651,7 @@
           <w:color w:val="1C2B3A"/>
           <w:sz w:val="22"/>
         </w:rPr>
-        <w:t xml:space="preserve"> is the public business site for P3MAI (Douglas Colvin's programme, project and PMO consultancy). It is a </w:t>
+        <w:t xml:space="preserve"> is the public business site for P3MAI (Douglas Colvin's program, project and PMO consultancy). It is a </w:t>
       </w:r>
       <w:r>
         <w:rPr>
@@ -591,7 +661,7 @@
           <w:color w:val="1C2B3A"/>
           <w:sz w:val="22"/>
         </w:rPr>
-        <w:t>hand-built static site</w:t>
+        <w:t>hand-built site with no framework and no build step</w:t>
       </w:r>
       <w:r>
         <w:rPr>
@@ -601,7 +671,47 @@
           <w:color w:val="1C2B3A"/>
           <w:sz w:val="22"/>
         </w:rPr>
-        <w:t xml:space="preserve"> — five pages plus a standalone cost estimator — with no framework and no build step: plain HTML5, CSS3 and vanilla JavaScript. It carries the P3MAI brand (navy/gold, Poppins, a pyramid logo) and links out to the two P3MAI web apps. It is hosted on </w:t>
+        <w:t xml:space="preserve"> — twelve HTML pages, two standalone estimators, one shared stylesheet and script, and exactly one piece of server-side code: </w:t>
+      </w:r>
+      <w:r>
+        <w:rPr>
+          <w:rFonts w:ascii="Consolas" w:hAnsi="Consolas" w:cs="Consolas"/>
+          <w:b w:val="0"/>
+          <w:i w:val="0"/>
+          <w:color w:val="1B3F6E"/>
+          <w:sz w:val="21"/>
+        </w:rPr>
+        <w:t>contact.php</w:t>
+      </w:r>
+      <w:r>
+        <w:rPr>
+          <w:rFonts w:ascii="Segoe UI" w:hAnsi="Segoe UI" w:cs="Segoe UI"/>
+          <w:b w:val="0"/>
+          <w:i w:val="0"/>
+          <w:color w:val="1C2B3A"/>
+          <w:sz w:val="22"/>
+        </w:rPr>
+        <w:t xml:space="preserve">, which emails enquiries to the domain mailbox. It carries the P3MAI brand (navy/gold, Poppins, pyramid logo, two-tone P3M+AI wordmark), presents a Board-level positioning (“AI-Enabled · Sovereign · Safe · Proven”), and links to six live P3MAI web apps through the </w:t>
+      </w:r>
+      <w:r>
+        <w:rPr>
+          <w:rFonts w:ascii="Segoe UI" w:hAnsi="Segoe UI" w:cs="Segoe UI"/>
+          <w:b/>
+          <w:i w:val="0"/>
+          <w:color w:val="1C2B3A"/>
+          <w:sz w:val="22"/>
+        </w:rPr>
+        <w:t>apps.p3mai.com front door</w:t>
+      </w:r>
+      <w:r>
+        <w:rPr>
+          <w:rFonts w:ascii="Segoe UI" w:hAnsi="Segoe UI" w:cs="Segoe UI"/>
+          <w:b w:val="0"/>
+          <w:i w:val="0"/>
+          <w:color w:val="1C2B3A"/>
+          <w:sz w:val="22"/>
+        </w:rPr>
+        <w:t xml:space="preserve">. Hosted on </w:t>
       </w:r>
       <w:r>
         <w:rPr>
@@ -621,7 +731,7 @@
           <w:color w:val="1C2B3A"/>
           <w:sz w:val="22"/>
         </w:rPr>
-        <w:t xml:space="preserve"> and served at </w:t>
+        <w:t xml:space="preserve"> at </w:t>
       </w:r>
       <w:r>
         <w:rPr>
@@ -753,7 +863,7 @@
           <w:color w:val="1C2B3A"/>
           <w:sz w:val="22"/>
         </w:rPr>
-        <w:t>Whoever maintains the site — comfortable editing HTML/CSS, no framework knowledge needed.</w:t>
+        <w:t>Whoever maintains the site — comfortable editing HTML/CSS/JS and one small PHP file.</w:t>
       </w:r>
     </w:p>
     <w:p>
@@ -781,7 +891,7 @@
           <w:color w:val="1C2B3A"/>
           <w:sz w:val="22"/>
         </w:rPr>
-        <w:t>Five linked pages, a shared header/footer, and a standalone estimator:</w:t>
+        <w:t>Twelve linked pages plus two standalone estimators, all sharing one header/footer shell:</w:t>
       </w:r>
     </w:p>
     <w:p>
@@ -791,7 +901,7 @@
       <w:r>
         <w:drawing>
           <wp:inline xmlns:a="http://schemas.openxmlformats.org/drawingml/2006/main" xmlns:pic="http://schemas.openxmlformats.org/drawingml/2006/picture">
-            <wp:extent cx="5580000" cy="3412109"/>
+            <wp:extent cx="5580000" cy="3403673"/>
             <wp:docPr id="1" name="Picture 1"/>
             <wp:cNvGraphicFramePr>
               <a:graphicFrameLocks noChangeAspect="1"/>
@@ -812,7 +922,7 @@
                   <pic:spPr>
                     <a:xfrm>
                       <a:off x="0" y="0"/>
-                      <a:ext cx="5580000" cy="3412109"/>
+                      <a:ext cx="5580000" cy="3403673"/>
                     </a:xfrm>
                     <a:prstGeom prst="rect"/>
                   </pic:spPr>
@@ -852,7 +962,7 @@
       <w:tr>
         <w:tc>
           <w:tcPr>
-            <w:tcW w:type="dxa" w:w="1814"/>
+            <w:tcW w:type="dxa" w:w="2948"/>
             <w:shd w:val="clear" w:fill="0B2545"/>
           </w:tcPr>
           <w:p>
@@ -870,7 +980,7 @@
         </w:tc>
         <w:tc>
           <w:tcPr>
-            <w:tcW w:type="dxa" w:w="6973"/>
+            <w:tcW w:type="dxa" w:w="5839"/>
             <w:shd w:val="clear" w:fill="0B2545"/>
           </w:tcPr>
           <w:p>
@@ -890,7 +1000,7 @@
       <w:tr>
         <w:tc>
           <w:tcPr>
-            <w:tcW w:type="dxa" w:w="1814"/>
+            <w:tcW w:type="dxa" w:w="2948"/>
           </w:tcPr>
           <w:p>
             <w:r>
@@ -907,7 +1017,7 @@
         </w:tc>
         <w:tc>
           <w:tcPr>
-            <w:tcW w:type="dxa" w:w="6973"/>
+            <w:tcW w:type="dxa" w:w="5839"/>
           </w:tcPr>
           <w:p>
             <w:r>
@@ -918,7 +1028,7 @@
                 <w:color w:val="1C2B3A"/>
                 <w:sz w:val="19"/>
               </w:rPr>
-              <w:t>Home — hero, feature cards, CV-sourced track record, call to action</w:t>
+              <w:t>Home — problem-led hero + capability strap, named-client strip, story section, track record, engagement ladder, dual CTA</w:t>
             </w:r>
           </w:p>
         </w:tc>
@@ -926,7 +1036,7 @@
       <w:tr>
         <w:tc>
           <w:tcPr>
-            <w:tcW w:type="dxa" w:w="1814"/>
+            <w:tcW w:type="dxa" w:w="2948"/>
             <w:shd w:val="clear" w:fill="F3F6FA"/>
           </w:tcPr>
           <w:p>
@@ -944,7 +1054,7 @@
         </w:tc>
         <w:tc>
           <w:tcPr>
-            <w:tcW w:type="dxa" w:w="6973"/>
+            <w:tcW w:type="dxa" w:w="5839"/>
             <w:shd w:val="clear" w:fill="F3F6FA"/>
           </w:tcPr>
           <w:p>
@@ -956,7 +1066,7 @@
                 <w:color w:val="1C2B3A"/>
                 <w:sz w:val="19"/>
               </w:rPr>
-              <w:t>Bio and career timeline (from the CV), certifications, values</w:t>
+              <w:t>Breadth-first bio, six-milestone career timeline, sovereign-and-safe credentials, certifications</w:t>
             </w:r>
           </w:p>
         </w:tc>
@@ -964,7 +1074,7 @@
       <w:tr>
         <w:tc>
           <w:tcPr>
-            <w:tcW w:type="dxa" w:w="1814"/>
+            <w:tcW w:type="dxa" w:w="2948"/>
           </w:tcPr>
           <w:p>
             <w:r>
@@ -981,7 +1091,7 @@
         </w:tc>
         <w:tc>
           <w:tcPr>
-            <w:tcW w:type="dxa" w:w="6973"/>
+            <w:tcW w:type="dxa" w:w="5839"/>
           </w:tcPr>
           <w:p>
             <w:r>
@@ -992,7 +1102,7 @@
                 <w:color w:val="1C2B3A"/>
                 <w:sz w:val="19"/>
               </w:rPr>
-              <w:t>Programme / Project / PMO cards; links to the PMO app and Method Map; comparison table</w:t>
+              <w:t>Three service cards (who-for lines, Service Details links, six app buttons), estimator CTA, comparison table</w:t>
             </w:r>
           </w:p>
         </w:tc>
@@ -1000,8 +1110,119 @@
       <w:tr>
         <w:tc>
           <w:tcPr>
-            <w:tcW w:type="dxa" w:w="1814"/>
+            <w:tcW w:type="dxa" w:w="2948"/>
             <w:shd w:val="clear" w:fill="F3F6FA"/>
+          </w:tcPr>
+          <w:p>
+            <w:r>
+              <w:rPr>
+                <w:rFonts w:ascii="Segoe UI" w:hAnsi="Segoe UI" w:cs="Segoe UI"/>
+                <w:b w:val="0"/>
+                <w:i w:val="0"/>
+                <w:color w:val="1C2B3A"/>
+                <w:sz w:val="19"/>
+              </w:rPr>
+              <w:t>program-management.html</w:t>
+            </w:r>
+          </w:p>
+        </w:tc>
+        <w:tc>
+          <w:tcPr>
+            <w:tcW w:type="dxa" w:w="5839"/>
+            <w:shd w:val="clear" w:fill="F3F6FA"/>
+          </w:tcPr>
+          <w:p>
+            <w:r>
+              <w:rPr>
+                <w:rFonts w:ascii="Segoe UI" w:hAnsi="Segoe UI" w:cs="Segoe UI"/>
+                <w:b w:val="0"/>
+                <w:i w:val="0"/>
+                <w:color w:val="1C2B3A"/>
+                <w:sz w:val="19"/>
+              </w:rPr>
+              <w:t>Service detail: triggers, method, Core42 supercomputers case study, ladder</w:t>
+            </w:r>
+          </w:p>
+        </w:tc>
+      </w:tr>
+      <w:tr>
+        <w:tc>
+          <w:tcPr>
+            <w:tcW w:type="dxa" w:w="2948"/>
+          </w:tcPr>
+          <w:p>
+            <w:r>
+              <w:rPr>
+                <w:rFonts w:ascii="Segoe UI" w:hAnsi="Segoe UI" w:cs="Segoe UI"/>
+                <w:b w:val="0"/>
+                <w:i w:val="0"/>
+                <w:color w:val="1C2B3A"/>
+                <w:sz w:val="19"/>
+              </w:rPr>
+              <w:t>project-management.html</w:t>
+            </w:r>
+          </w:p>
+        </w:tc>
+        <w:tc>
+          <w:tcPr>
+            <w:tcW w:type="dxa" w:w="5839"/>
+          </w:tcPr>
+          <w:p>
+            <w:r>
+              <w:rPr>
+                <w:rFonts w:ascii="Segoe UI" w:hAnsi="Segoe UI" w:cs="Segoe UI"/>
+                <w:b w:val="0"/>
+                <w:i w:val="0"/>
+                <w:color w:val="1C2B3A"/>
+                <w:sz w:val="19"/>
+              </w:rPr>
+              <w:t>Service detail: triggers, method, ENBD fraud case study, ladder</w:t>
+            </w:r>
+          </w:p>
+        </w:tc>
+      </w:tr>
+      <w:tr>
+        <w:tc>
+          <w:tcPr>
+            <w:tcW w:type="dxa" w:w="2948"/>
+            <w:shd w:val="clear" w:fill="F3F6FA"/>
+          </w:tcPr>
+          <w:p>
+            <w:r>
+              <w:rPr>
+                <w:rFonts w:ascii="Segoe UI" w:hAnsi="Segoe UI" w:cs="Segoe UI"/>
+                <w:b w:val="0"/>
+                <w:i w:val="0"/>
+                <w:color w:val="1C2B3A"/>
+                <w:sz w:val="19"/>
+              </w:rPr>
+              <w:t>pmo-services.html</w:t>
+            </w:r>
+          </w:p>
+        </w:tc>
+        <w:tc>
+          <w:tcPr>
+            <w:tcW w:type="dxa" w:w="5839"/>
+            <w:shd w:val="clear" w:fill="F3F6FA"/>
+          </w:tcPr>
+          <w:p>
+            <w:r>
+              <w:rPr>
+                <w:rFonts w:ascii="Segoe UI" w:hAnsi="Segoe UI" w:cs="Segoe UI"/>
+                <w:b w:val="0"/>
+                <w:i w:val="0"/>
+                <w:color w:val="1C2B3A"/>
+                <w:sz w:val="19"/>
+              </w:rPr>
+              <w:t>Service detail: triggers, method, Core42 Responsible-AI-PMO + Emirates/dnata case studies, ladder</w:t>
+            </w:r>
+          </w:p>
+        </w:tc>
+      </w:tr>
+      <w:tr>
+        <w:tc>
+          <w:tcPr>
+            <w:tcW w:type="dxa" w:w="2948"/>
           </w:tcPr>
           <w:p>
             <w:r>
@@ -1018,7 +1239,26 @@
         </w:tc>
         <w:tc>
           <w:tcPr>
-            <w:tcW w:type="dxa" w:w="6973"/>
+            <w:tcW w:type="dxa" w:w="5839"/>
+          </w:tcPr>
+          <w:p>
+            <w:r>
+              <w:rPr>
+                <w:rFonts w:ascii="Segoe UI" w:hAnsi="Segoe UI" w:cs="Segoe UI"/>
+                <w:b w:val="0"/>
+                <w:i w:val="0"/>
+                <w:color w:val="1C2B3A"/>
+                <w:sz w:val="19"/>
+              </w:rPr>
+              <w:t>Four posts, each linking to a full article page</w:t>
+            </w:r>
+          </w:p>
+        </w:tc>
+      </w:tr>
+      <w:tr>
+        <w:tc>
+          <w:tcPr>
+            <w:tcW w:type="dxa" w:w="2948"/>
             <w:shd w:val="clear" w:fill="F3F6FA"/>
           </w:tcPr>
           <w:p>
@@ -1030,7 +1270,25 @@
                 <w:color w:val="1C2B3A"/>
                 <w:sz w:val="19"/>
               </w:rPr>
-              <w:t>AI / project-management posts</w:t>
+              <w:t>building-web-apps-with-claude.html</w:t>
+            </w:r>
+          </w:p>
+        </w:tc>
+        <w:tc>
+          <w:tcPr>
+            <w:tcW w:type="dxa" w:w="5839"/>
+            <w:shd w:val="clear" w:fill="F3F6FA"/>
+          </w:tcPr>
+          <w:p>
+            <w:r>
+              <w:rPr>
+                <w:rFonts w:ascii="Segoe UI" w:hAnsi="Segoe UI" w:cs="Segoe UI"/>
+                <w:b w:val="0"/>
+                <w:i w:val="0"/>
+                <w:color w:val="1C2B3A"/>
+                <w:sz w:val="19"/>
+              </w:rPr>
+              <w:t>Article: the site/apps built with Claude — the case study</w:t>
             </w:r>
           </w:p>
         </w:tc>
@@ -1038,7 +1296,118 @@
       <w:tr>
         <w:tc>
           <w:tcPr>
-            <w:tcW w:type="dxa" w:w="1814"/>
+            <w:tcW w:type="dxa" w:w="2948"/>
+          </w:tcPr>
+          <w:p>
+            <w:r>
+              <w:rPr>
+                <w:rFonts w:ascii="Segoe UI" w:hAnsi="Segoe UI" w:cs="Segoe UI"/>
+                <w:b w:val="0"/>
+                <w:i w:val="0"/>
+                <w:color w:val="1C2B3A"/>
+                <w:sz w:val="19"/>
+              </w:rPr>
+              <w:t>ai-programs-need-a-pmo.html</w:t>
+            </w:r>
+          </w:p>
+        </w:tc>
+        <w:tc>
+          <w:tcPr>
+            <w:tcW w:type="dxa" w:w="5839"/>
+          </w:tcPr>
+          <w:p>
+            <w:r>
+              <w:rPr>
+                <w:rFonts w:ascii="Segoe UI" w:hAnsi="Segoe UI" w:cs="Segoe UI"/>
+                <w:b w:val="0"/>
+                <w:i w:val="0"/>
+                <w:color w:val="1C2B3A"/>
+                <w:sz w:val="19"/>
+              </w:rPr>
+              <w:t>Article: day-one governance for AI programs</w:t>
+            </w:r>
+          </w:p>
+        </w:tc>
+      </w:tr>
+      <w:tr>
+        <w:tc>
+          <w:tcPr>
+            <w:tcW w:type="dxa" w:w="2948"/>
+            <w:shd w:val="clear" w:fill="F3F6FA"/>
+          </w:tcPr>
+          <w:p>
+            <w:r>
+              <w:rPr>
+                <w:rFonts w:ascii="Segoe UI" w:hAnsi="Segoe UI" w:cs="Segoe UI"/>
+                <w:b w:val="0"/>
+                <w:i w:val="0"/>
+                <w:color w:val="1C2B3A"/>
+                <w:sz w:val="19"/>
+              </w:rPr>
+              <w:t>scaling-ai-infrastructure.html</w:t>
+            </w:r>
+          </w:p>
+        </w:tc>
+        <w:tc>
+          <w:tcPr>
+            <w:tcW w:type="dxa" w:w="5839"/>
+            <w:shd w:val="clear" w:fill="F3F6FA"/>
+          </w:tcPr>
+          <w:p>
+            <w:r>
+              <w:rPr>
+                <w:rFonts w:ascii="Segoe UI" w:hAnsi="Segoe UI" w:cs="Segoe UI"/>
+                <w:b w:val="0"/>
+                <w:i w:val="0"/>
+                <w:color w:val="1C2B3A"/>
+                <w:sz w:val="19"/>
+              </w:rPr>
+              <w:t>Article: TOP500-scale delivery discipline</w:t>
+            </w:r>
+          </w:p>
+        </w:tc>
+      </w:tr>
+      <w:tr>
+        <w:tc>
+          <w:tcPr>
+            <w:tcW w:type="dxa" w:w="2948"/>
+          </w:tcPr>
+          <w:p>
+            <w:r>
+              <w:rPr>
+                <w:rFonts w:ascii="Segoe UI" w:hAnsi="Segoe UI" w:cs="Segoe UI"/>
+                <w:b w:val="0"/>
+                <w:i w:val="0"/>
+                <w:color w:val="1C2B3A"/>
+                <w:sz w:val="19"/>
+              </w:rPr>
+              <w:t>agentic-ai-in-the-pmo.html</w:t>
+            </w:r>
+          </w:p>
+        </w:tc>
+        <w:tc>
+          <w:tcPr>
+            <w:tcW w:type="dxa" w:w="5839"/>
+          </w:tcPr>
+          <w:p>
+            <w:r>
+              <w:rPr>
+                <w:rFonts w:ascii="Segoe UI" w:hAnsi="Segoe UI" w:cs="Segoe UI"/>
+                <w:b w:val="0"/>
+                <w:i w:val="0"/>
+                <w:color w:val="1C2B3A"/>
+                <w:sz w:val="19"/>
+              </w:rPr>
+              <w:t>Article: agents do assembly, humans do judgment</w:t>
+            </w:r>
+          </w:p>
+        </w:tc>
+      </w:tr>
+      <w:tr>
+        <w:tc>
+          <w:tcPr>
+            <w:tcW w:type="dxa" w:w="2948"/>
+            <w:shd w:val="clear" w:fill="F3F6FA"/>
           </w:tcPr>
           <w:p>
             <w:r>
@@ -1055,7 +1424,8 @@
         </w:tc>
         <w:tc>
           <w:tcPr>
-            <w:tcW w:type="dxa" w:w="6973"/>
+            <w:tcW w:type="dxa" w:w="5839"/>
+            <w:shd w:val="clear" w:fill="F3F6FA"/>
           </w:tcPr>
           <w:p>
             <w:r>
@@ -1066,7 +1436,7 @@
                 <w:color w:val="1C2B3A"/>
                 <w:sz w:val="19"/>
               </w:rPr>
-              <w:t>Validated contact form, contact details, map</w:t>
+              <w:t>Validated form (posts to contact.php), details, map</w:t>
             </w:r>
           </w:p>
         </w:tc>
@@ -1074,7 +1444,43 @@
       <w:tr>
         <w:tc>
           <w:tcPr>
-            <w:tcW w:type="dxa" w:w="1814"/>
+            <w:tcW w:type="dxa" w:w="2948"/>
+          </w:tcPr>
+          <w:p>
+            <w:r>
+              <w:rPr>
+                <w:rFonts w:ascii="Segoe UI" w:hAnsi="Segoe UI" w:cs="Segoe UI"/>
+                <w:b w:val="0"/>
+                <w:i w:val="0"/>
+                <w:color w:val="1C2B3A"/>
+                <w:sz w:val="19"/>
+              </w:rPr>
+              <w:t>p3mai_services_cost_estimator.html</w:t>
+            </w:r>
+          </w:p>
+        </w:tc>
+        <w:tc>
+          <w:tcPr>
+            <w:tcW w:type="dxa" w:w="5839"/>
+          </w:tcPr>
+          <w:p>
+            <w:r>
+              <w:rPr>
+                <w:rFonts w:ascii="Segoe UI" w:hAnsi="Segoe UI" w:cs="Segoe UI"/>
+                <w:b w:val="0"/>
+                <w:i w:val="0"/>
+                <w:color w:val="1C2B3A"/>
+                <w:sz w:val="19"/>
+              </w:rPr>
+              <w:t>THE services estimator — towers, 12 products, POTI, tiers, licence scale; quote button carries the basket to the contact form</w:t>
+            </w:r>
+          </w:p>
+        </w:tc>
+      </w:tr>
+      <w:tr>
+        <w:tc>
+          <w:tcPr>
+            <w:tcW w:type="dxa" w:w="2948"/>
             <w:shd w:val="clear" w:fill="F3F6FA"/>
           </w:tcPr>
           <w:p>
@@ -1092,7 +1498,7 @@
         </w:tc>
         <w:tc>
           <w:tcPr>
-            <w:tcW w:type="dxa" w:w="6973"/>
+            <w:tcW w:type="dxa" w:w="5839"/>
             <w:shd w:val="clear" w:fill="F3F6FA"/>
           </w:tcPr>
           <w:p>
@@ -1104,45 +1510,13 @@
                 <w:color w:val="1C2B3A"/>
                 <w:sz w:val="19"/>
               </w:rPr>
-              <w:t>Project Cost Estimator — a standalone interactive tool</w:t>
+              <w:t>Legacy standalone web-project estimator (unlinked)</w:t>
             </w:r>
           </w:p>
         </w:tc>
       </w:tr>
     </w:tbl>
     <w:p/>
-    <w:p>
-      <w:r>
-        <w:rPr>
-          <w:rFonts w:ascii="Segoe UI" w:hAnsi="Segoe UI" w:cs="Segoe UI"/>
-          <w:b w:val="0"/>
-          <w:i w:val="0"/>
-          <w:color w:val="1C2B3A"/>
-          <w:sz w:val="22"/>
-        </w:rPr>
-        <w:t xml:space="preserve">An auxiliary </w:t>
-      </w:r>
-      <w:r>
-        <w:rPr>
-          <w:rFonts w:ascii="Consolas" w:hAnsi="Consolas" w:cs="Consolas"/>
-          <w:b w:val="0"/>
-          <w:i w:val="0"/>
-          <w:color w:val="1B3F6E"/>
-          <w:sz w:val="21"/>
-        </w:rPr>
-        <w:t>dashboard.html</w:t>
-      </w:r>
-      <w:r>
-        <w:rPr>
-          <w:rFonts w:ascii="Segoe UI" w:hAnsi="Segoe UI" w:cs="Segoe UI"/>
-          <w:b w:val="0"/>
-          <w:i w:val="0"/>
-          <w:color w:val="1C2B3A"/>
-          <w:sz w:val="22"/>
-        </w:rPr>
-        <w:t xml:space="preserve"> productivity/notes page also exists outside the main navigation.</w:t>
-      </w:r>
-    </w:p>
     <w:p>
       <w:pPr>
         <w:pStyle w:val="Heading1"/>
@@ -1276,7 +1650,7 @@
                 <w:color w:val="1C2B3A"/>
                 <w:sz w:val="19"/>
               </w:rPr>
-              <w:t>A single CSS design system (style.css)</w:t>
+              <w:t>A single CSS design system (style.css, versioned ?v=N)</w:t>
             </w:r>
           </w:p>
         </w:tc>
@@ -1312,7 +1686,7 @@
                 <w:color w:val="1C2B3A"/>
                 <w:sz w:val="19"/>
               </w:rPr>
-              <w:t>Vanilla JavaScript (script.js) — no framework, no build</w:t>
+              <w:t>Vanilla JavaScript (script.js, versioned ?v=N) — no framework, no build</w:t>
             </w:r>
           </w:p>
         </w:tc>
@@ -1332,6 +1706,43 @@
                 <w:color w:val="1C2B3A"/>
                 <w:sz w:val="19"/>
               </w:rPr>
+              <w:t>Server-side</w:t>
+            </w:r>
+          </w:p>
+        </w:tc>
+        <w:tc>
+          <w:tcPr>
+            <w:tcW w:type="dxa" w:w="6973"/>
+            <w:shd w:val="clear" w:fill="F3F6FA"/>
+          </w:tcPr>
+          <w:p>
+            <w:r>
+              <w:rPr>
+                <w:rFonts w:ascii="Segoe UI" w:hAnsi="Segoe UI" w:cs="Segoe UI"/>
+                <w:b w:val="0"/>
+                <w:i w:val="0"/>
+                <w:color w:val="1C2B3A"/>
+                <w:sz w:val="19"/>
+              </w:rPr>
+              <w:t>contact.php only — the mail handler (PHP 8 on Rise)</w:t>
+            </w:r>
+          </w:p>
+        </w:tc>
+      </w:tr>
+      <w:tr>
+        <w:tc>
+          <w:tcPr>
+            <w:tcW w:type="dxa" w:w="1814"/>
+          </w:tcPr>
+          <w:p>
+            <w:r>
+              <w:rPr>
+                <w:rFonts w:ascii="Segoe UI" w:hAnsi="Segoe UI" w:cs="Segoe UI"/>
+                <w:b w:val="0"/>
+                <w:i w:val="0"/>
+                <w:color w:val="1C2B3A"/>
+                <w:sz w:val="19"/>
+              </w:rPr>
               <w:t>Fonts</w:t>
             </w:r>
           </w:p>
@@ -1339,7 +1750,6 @@
         <w:tc>
           <w:tcPr>
             <w:tcW w:type="dxa" w:w="6973"/>
-            <w:shd w:val="clear" w:fill="F3F6FA"/>
           </w:tcPr>
           <w:p>
             <w:r>
@@ -1359,6 +1769,7 @@
         <w:tc>
           <w:tcPr>
             <w:tcW w:type="dxa" w:w="1814"/>
+            <w:shd w:val="clear" w:fill="F3F6FA"/>
           </w:tcPr>
           <w:p>
             <w:r>
@@ -1376,6 +1787,7 @@
         <w:tc>
           <w:tcPr>
             <w:tcW w:type="dxa" w:w="6973"/>
+            <w:shd w:val="clear" w:fill="F3F6FA"/>
           </w:tcPr>
           <w:p>
             <w:r>
@@ -1386,7 +1798,7 @@
                 <w:color w:val="1C2B3A"/>
                 <w:sz w:val="19"/>
               </w:rPr>
-              <w:t>SVG logo set, optimised JP/PNG imagery</w:t>
+              <w:t>SVG logo set, 3D tile icons, blog thumbnails</w:t>
             </w:r>
           </w:p>
         </w:tc>
@@ -1395,7 +1807,6 @@
         <w:tc>
           <w:tcPr>
             <w:tcW w:type="dxa" w:w="1814"/>
-            <w:shd w:val="clear" w:fill="F3F6FA"/>
           </w:tcPr>
           <w:p>
             <w:r>
@@ -1413,7 +1824,6 @@
         <w:tc>
           <w:tcPr>
             <w:tcW w:type="dxa" w:w="6973"/>
-            <w:shd w:val="clear" w:fill="F3F6FA"/>
           </w:tcPr>
           <w:p>
             <w:r>
@@ -1424,7 +1834,7 @@
                 <w:color w:val="1C2B3A"/>
                 <w:sz w:val="19"/>
               </w:rPr>
-              <w:t>Rise (UK shared cPanel/FTP)</w:t>
+              <w:t>Rise (UK shared cPanel/FTP) behind StackCDN</w:t>
             </w:r>
           </w:p>
         </w:tc>
@@ -1457,7 +1867,7 @@
                 <w:color w:val="0B2545"/>
                 <w:sz w:val="21"/>
               </w:rPr>
-              <w:t>🔒  No build step by design</w:t>
+              <w:t>🔒  Almost no build step — by design</w:t>
             </w:r>
           </w:p>
           <w:p>
@@ -1469,7 +1879,7 @@
                 <w:color w:val="1C2B3A"/>
                 <w:sz w:val="20"/>
               </w:rPr>
-              <w:t>The site is deliberately static and dependency-free — nothing to compile, nothing to break. Edit an HTML/CSS/JS file, preview, and publish.</w:t>
+              <w:t>Static pages plus one PHP endpoint. Edit, preview, publish. The only compiled artefacts anywhere are these documents.</w:t>
             </w:r>
           </w:p>
         </w:tc>
@@ -1489,7 +1899,7 @@
           <w:color w:val="0B2545"/>
           <w:sz w:val="32"/>
         </w:rPr>
-        <w:t>5.  Design system</w:t>
+        <w:t>5.  Design system &amp; brand</w:t>
       </w:r>
     </w:p>
     <w:tbl>
@@ -1719,7 +2129,45 @@
                 <w:color w:val="1C2B3A"/>
                 <w:sz w:val="19"/>
               </w:rPr>
-              <w:t>Original plan-view pyramid mark + wordmark (navy on light, white on dark)</w:t>
+              <w:t>Original plan-view pyramid mark; wordmark is HTML text</w:t>
+            </w:r>
+          </w:p>
+        </w:tc>
+      </w:tr>
+      <w:tr>
+        <w:tc>
+          <w:tcPr>
+            <w:tcW w:type="dxa" w:w="2041"/>
+            <w:shd w:val="clear" w:fill="F3F6FA"/>
+          </w:tcPr>
+          <w:p>
+            <w:r>
+              <w:rPr>
+                <w:rFonts w:ascii="Segoe UI" w:hAnsi="Segoe UI" w:cs="Segoe UI"/>
+                <w:b w:val="0"/>
+                <w:i w:val="0"/>
+                <w:color w:val="1C2B3A"/>
+                <w:sz w:val="19"/>
+              </w:rPr>
+              <w:t>Wordmark rule</w:t>
+            </w:r>
+          </w:p>
+        </w:tc>
+        <w:tc>
+          <w:tcPr>
+            <w:tcW w:type="dxa" w:w="6746"/>
+            <w:shd w:val="clear" w:fill="F3F6FA"/>
+          </w:tcPr>
+          <w:p>
+            <w:r>
+              <w:rPr>
+                <w:rFonts w:ascii="Segoe UI" w:hAnsi="Segoe UI" w:cs="Segoe UI"/>
+                <w:b w:val="0"/>
+                <w:i w:val="0"/>
+                <w:color w:val="1C2B3A"/>
+                <w:sz w:val="19"/>
+              </w:rPr>
+              <w:t>Always two-tone: 'P3M' in primary, 'AI' in gold — never flat</w:t>
             </w:r>
           </w:p>
         </w:tc>
@@ -1745,7 +2193,7 @@
           <w:color w:val="1C2B3A"/>
           <w:sz w:val="22"/>
         </w:rPr>
-        <w:t xml:space="preserve"> holds the shared design system — layout, typography, buttons, cards, the sticky navigation and responsive breakpoints. The </w:t>
+        <w:t xml:space="preserve"> holds the shared design system, including the copy-overhaul components: hero eyebrow strap, ghost buttons, client strip, story section, engagement-ladder cards, case-study blocks, trigger lists, article typography and the takeaways box. The </w:t>
       </w:r>
       <w:r>
         <w:rPr>
@@ -1765,7 +2213,7 @@
           <w:color w:val="1C2B3A"/>
           <w:sz w:val="22"/>
         </w:rPr>
-        <w:t xml:space="preserve"> (except the active nav item) so the site reads as one piece.</w:t>
+        <w:t xml:space="preserve"> (except the active nav item).</w:t>
       </w:r>
     </w:p>
     <w:p>
@@ -1828,7 +2276,7 @@
           <w:color w:val="1C2B3A"/>
           <w:sz w:val="22"/>
         </w:rPr>
-        <w:t xml:space="preserve"> — rewrites the PMO and Method Map links to the live domains in production, leaving them at localhost in dev (see §7);</w:t>
+        <w:t xml:space="preserve"> — six Services-page buttons carry localhost dev defaults; script.js swaps them to the live apps.p3mai.com URLs in production (see §7);</w:t>
       </w:r>
     </w:p>
     <w:p>
@@ -1843,7 +2291,7 @@
           <w:color w:val="1C2B3A"/>
           <w:sz w:val="22"/>
         </w:rPr>
-        <w:t>Page-transition overlay</w:t>
+        <w:t>Contact-form context prefill</w:t>
       </w:r>
       <w:r>
         <w:rPr>
@@ -1853,7 +2301,7 @@
           <w:color w:val="1C2B3A"/>
           <w:sz w:val="22"/>
         </w:rPr>
-        <w:t xml:space="preserve"> — a soft fade between internal pages;</w:t>
+        <w:t xml:space="preserve"> — Get in Touch buttons pass ?interest=&lt;service&gt;, the estimator passes its itemised basket as ?details=; both land in the Message field, never overwriting typed text;</w:t>
       </w:r>
     </w:p>
     <w:p>
@@ -1868,7 +2316,7 @@
           <w:color w:val="1C2B3A"/>
           <w:sz w:val="22"/>
         </w:rPr>
-        <w:t>Responsive navigation</w:t>
+        <w:t>Real form submission</w:t>
       </w:r>
       <w:r>
         <w:rPr>
@@ -1878,7 +2326,7 @@
           <w:color w:val="1C2B3A"/>
           <w:sz w:val="22"/>
         </w:rPr>
-        <w:t xml:space="preserve"> — a hamburger menu on small screens;</w:t>
+        <w:t xml:space="preserve"> — fetch POST to contact.php with a locked Sending… state, a genuine success message, and a graceful direct-email fallback on failure;</w:t>
       </w:r>
     </w:p>
     <w:p>
@@ -1893,67 +2341,7 @@
           <w:color w:val="1C2B3A"/>
           <w:sz w:val="22"/>
         </w:rPr>
-        <w:t>Reveal-on-scroll</w:t>
-      </w:r>
-      <w:r>
-        <w:rPr>
-          <w:rFonts w:ascii="Segoe UI" w:hAnsi="Segoe UI" w:cs="Segoe UI"/>
-          <w:b w:val="0"/>
-          <w:i w:val="0"/>
-          <w:color w:val="1C2B3A"/>
-          <w:sz w:val="22"/>
-        </w:rPr>
-        <w:t xml:space="preserve"> animations for sections;</w:t>
-      </w:r>
-    </w:p>
-    <w:p>
-      <w:pPr>
-        <w:pStyle w:val="ListBullet"/>
-      </w:pPr>
-      <w:r>
-        <w:rPr>
-          <w:rFonts w:ascii="Segoe UI" w:hAnsi="Segoe UI" w:cs="Segoe UI"/>
-          <w:b/>
-          <w:i w:val="0"/>
-          <w:color w:val="1C2B3A"/>
-          <w:sz w:val="22"/>
-        </w:rPr>
-        <w:t>Contact-form validation</w:t>
-      </w:r>
-      <w:r>
-        <w:rPr>
-          <w:rFonts w:ascii="Segoe UI" w:hAnsi="Segoe UI" w:cs="Segoe UI"/>
-          <w:b w:val="0"/>
-          <w:i w:val="0"/>
-          <w:color w:val="1C2B3A"/>
-          <w:sz w:val="22"/>
-        </w:rPr>
-        <w:t xml:space="preserve"> — client-side checks before submit;</w:t>
-      </w:r>
-    </w:p>
-    <w:p>
-      <w:pPr>
-        <w:pStyle w:val="ListBullet"/>
-      </w:pPr>
-      <w:r>
-        <w:rPr>
-          <w:rFonts w:ascii="Segoe UI" w:hAnsi="Segoe UI" w:cs="Segoe UI"/>
-          <w:b/>
-          <w:i w:val="0"/>
-          <w:color w:val="1C2B3A"/>
-          <w:sz w:val="22"/>
-        </w:rPr>
-        <w:t>Smooth scrolling</w:t>
-      </w:r>
-      <w:r>
-        <w:rPr>
-          <w:rFonts w:ascii="Segoe UI" w:hAnsi="Segoe UI" w:cs="Segoe UI"/>
-          <w:b w:val="0"/>
-          <w:i w:val="0"/>
-          <w:color w:val="1C2B3A"/>
-          <w:sz w:val="22"/>
-        </w:rPr>
-        <w:t xml:space="preserve"> for in-page anchor links.</w:t>
+        <w:t>Page-transition overlay, responsive hamburger nav, reveal-on-scroll, client-side validation, smooth scrolling.</w:t>
       </w:r>
     </w:p>
     <w:p>
@@ -1981,7 +2369,27 @@
           <w:color w:val="1C2B3A"/>
           <w:sz w:val="22"/>
         </w:rPr>
-        <w:t>The Services page links to the two P3MAI apps, both of which link back to the site:</w:t>
+        <w:t xml:space="preserve">All six P3MAI apps are served behind one front door — </w:t>
+      </w:r>
+      <w:r>
+        <w:rPr>
+          <w:rFonts w:ascii="Segoe UI" w:hAnsi="Segoe UI" w:cs="Segoe UI"/>
+          <w:b/>
+          <w:i w:val="0"/>
+          <w:color w:val="1C2B3A"/>
+          <w:sz w:val="22"/>
+        </w:rPr>
+        <w:t>apps.p3mai.com</w:t>
+      </w:r>
+      <w:r>
+        <w:rPr>
+          <w:rFonts w:ascii="Segoe UI" w:hAnsi="Segoe UI" w:cs="Segoe UI"/>
+          <w:b w:val="0"/>
+          <w:i w:val="0"/>
+          <w:color w:val="1C2B3A"/>
+          <w:sz w:val="22"/>
+        </w:rPr>
+        <w:t>, a Render reverse proxy — and every app links back to the site:</w:t>
       </w:r>
     </w:p>
     <w:tbl>
@@ -1998,7 +2406,7 @@
       <w:tr>
         <w:tc>
           <w:tcPr>
-            <w:tcW w:type="dxa" w:w="2494"/>
+            <w:tcW w:type="dxa" w:w="2608"/>
             <w:shd w:val="clear" w:fill="0B2545"/>
           </w:tcPr>
           <w:p>
@@ -2010,13 +2418,13 @@
                 <w:color w:val="FFFFFF"/>
                 <w:sz w:val="20"/>
               </w:rPr>
-              <w:t>Link</w:t>
+              <w:t>Services-page button</w:t>
             </w:r>
           </w:p>
         </w:tc>
         <w:tc>
           <w:tcPr>
-            <w:tcW w:type="dxa" w:w="2041"/>
+            <w:tcW w:type="dxa" w:w="1928"/>
             <w:shd w:val="clear" w:fill="0B2545"/>
           </w:tcPr>
           <w:p>
@@ -2028,7 +2436,7 @@
                 <w:color w:val="FFFFFF"/>
                 <w:sz w:val="20"/>
               </w:rPr>
-              <w:t>Dev</w:t>
+              <w:t>Dev default</w:t>
             </w:r>
           </w:p>
         </w:tc>
@@ -2054,7 +2462,7 @@
       <w:tr>
         <w:tc>
           <w:tcPr>
-            <w:tcW w:type="dxa" w:w="2494"/>
+            <w:tcW w:type="dxa" w:w="2608"/>
           </w:tcPr>
           <w:p>
             <w:r>
@@ -2065,13 +2473,13 @@
                 <w:color w:val="1C2B3A"/>
                 <w:sz w:val="19"/>
               </w:rPr>
-              <w:t>PMO Service ('Example')</w:t>
+              <w:t>PMO Example</w:t>
             </w:r>
           </w:p>
         </w:tc>
         <w:tc>
           <w:tcPr>
-            <w:tcW w:type="dxa" w:w="2041"/>
+            <w:tcW w:type="dxa" w:w="1928"/>
           </w:tcPr>
           <w:p>
             <w:r>
@@ -2099,7 +2507,7 @@
                 <w:color w:val="1C2B3A"/>
                 <w:sz w:val="19"/>
               </w:rPr>
-              <w:t>app.p3mai.com</w:t>
+              <w:t>apps.p3mai.com/pmo</w:t>
             </w:r>
           </w:p>
         </w:tc>
@@ -2107,8 +2515,63 @@
       <w:tr>
         <w:tc>
           <w:tcPr>
-            <w:tcW w:type="dxa" w:w="2494"/>
+            <w:tcW w:type="dxa" w:w="2608"/>
             <w:shd w:val="clear" w:fill="F3F6FA"/>
+          </w:tcPr>
+          <w:p>
+            <w:r>
+              <w:rPr>
+                <w:rFonts w:ascii="Segoe UI" w:hAnsi="Segoe UI" w:cs="Segoe UI"/>
+                <w:b w:val="0"/>
+                <w:i w:val="0"/>
+                <w:color w:val="1C2B3A"/>
+                <w:sz w:val="19"/>
+              </w:rPr>
+              <w:t>P3M3 Maturity Assessment</w:t>
+            </w:r>
+          </w:p>
+        </w:tc>
+        <w:tc>
+          <w:tcPr>
+            <w:tcW w:type="dxa" w:w="1928"/>
+            <w:shd w:val="clear" w:fill="F3F6FA"/>
+          </w:tcPr>
+          <w:p>
+            <w:r>
+              <w:rPr>
+                <w:rFonts w:ascii="Segoe UI" w:hAnsi="Segoe UI" w:cs="Segoe UI"/>
+                <w:b w:val="0"/>
+                <w:i w:val="0"/>
+                <w:color w:val="1C2B3A"/>
+                <w:sz w:val="19"/>
+              </w:rPr>
+              <w:t>localhost:5174</w:t>
+            </w:r>
+          </w:p>
+        </w:tc>
+        <w:tc>
+          <w:tcPr>
+            <w:tcW w:type="dxa" w:w="4252"/>
+            <w:shd w:val="clear" w:fill="F3F6FA"/>
+          </w:tcPr>
+          <w:p>
+            <w:r>
+              <w:rPr>
+                <w:rFonts w:ascii="Segoe UI" w:hAnsi="Segoe UI" w:cs="Segoe UI"/>
+                <w:b w:val="0"/>
+                <w:i w:val="0"/>
+                <w:color w:val="1C2B3A"/>
+                <w:sz w:val="19"/>
+              </w:rPr>
+              <w:t>apps.p3mai.com/p3m3</w:t>
+            </w:r>
+          </w:p>
+        </w:tc>
+      </w:tr>
+      <w:tr>
+        <w:tc>
+          <w:tcPr>
+            <w:tcW w:type="dxa" w:w="2608"/>
           </w:tcPr>
           <w:p>
             <w:r>
@@ -2125,8 +2588,7 @@
         </w:tc>
         <w:tc>
           <w:tcPr>
-            <w:tcW w:type="dxa" w:w="2041"/>
-            <w:shd w:val="clear" w:fill="F3F6FA"/>
+            <w:tcW w:type="dxa" w:w="1928"/>
           </w:tcPr>
           <w:p>
             <w:r>
@@ -2144,6 +2606,25 @@
         <w:tc>
           <w:tcPr>
             <w:tcW w:type="dxa" w:w="4252"/>
+          </w:tcPr>
+          <w:p>
+            <w:r>
+              <w:rPr>
+                <w:rFonts w:ascii="Segoe UI" w:hAnsi="Segoe UI" w:cs="Segoe UI"/>
+                <w:b w:val="0"/>
+                <w:i w:val="0"/>
+                <w:color w:val="1C2B3A"/>
+                <w:sz w:val="19"/>
+              </w:rPr>
+              <w:t>apps.p3mai.com/prince2</w:t>
+            </w:r>
+          </w:p>
+        </w:tc>
+      </w:tr>
+      <w:tr>
+        <w:tc>
+          <w:tcPr>
+            <w:tcW w:type="dxa" w:w="2608"/>
             <w:shd w:val="clear" w:fill="F3F6FA"/>
           </w:tcPr>
           <w:p>
@@ -2155,7 +2636,152 @@
                 <w:color w:val="1C2B3A"/>
                 <w:sz w:val="19"/>
               </w:rPr>
-              <w:t>method-map.onrender.com (→ prince2.p3mai.com)</w:t>
+              <w:t>MSP Method Map</w:t>
+            </w:r>
+          </w:p>
+        </w:tc>
+        <w:tc>
+          <w:tcPr>
+            <w:tcW w:type="dxa" w:w="1928"/>
+            <w:shd w:val="clear" w:fill="F3F6FA"/>
+          </w:tcPr>
+          <w:p>
+            <w:r>
+              <w:rPr>
+                <w:rFonts w:ascii="Segoe UI" w:hAnsi="Segoe UI" w:cs="Segoe UI"/>
+                <w:b w:val="0"/>
+                <w:i w:val="0"/>
+                <w:color w:val="1C2B3A"/>
+                <w:sz w:val="19"/>
+              </w:rPr>
+              <w:t>localhost:5176</w:t>
+            </w:r>
+          </w:p>
+        </w:tc>
+        <w:tc>
+          <w:tcPr>
+            <w:tcW w:type="dxa" w:w="4252"/>
+            <w:shd w:val="clear" w:fill="F3F6FA"/>
+          </w:tcPr>
+          <w:p>
+            <w:r>
+              <w:rPr>
+                <w:rFonts w:ascii="Segoe UI" w:hAnsi="Segoe UI" w:cs="Segoe UI"/>
+                <w:b w:val="0"/>
+                <w:i w:val="0"/>
+                <w:color w:val="1C2B3A"/>
+                <w:sz w:val="19"/>
+              </w:rPr>
+              <w:t>apps.p3mai.com/msp</w:t>
+            </w:r>
+          </w:p>
+        </w:tc>
+      </w:tr>
+      <w:tr>
+        <w:tc>
+          <w:tcPr>
+            <w:tcW w:type="dxa" w:w="2608"/>
+          </w:tcPr>
+          <w:p>
+            <w:r>
+              <w:rPr>
+                <w:rFonts w:ascii="Segoe UI" w:hAnsi="Segoe UI" w:cs="Segoe UI"/>
+                <w:b w:val="0"/>
+                <w:i w:val="0"/>
+                <w:color w:val="1C2B3A"/>
+                <w:sz w:val="19"/>
+              </w:rPr>
+              <w:t>SAFe Method Map</w:t>
+            </w:r>
+          </w:p>
+        </w:tc>
+        <w:tc>
+          <w:tcPr>
+            <w:tcW w:type="dxa" w:w="1928"/>
+          </w:tcPr>
+          <w:p>
+            <w:r>
+              <w:rPr>
+                <w:rFonts w:ascii="Segoe UI" w:hAnsi="Segoe UI" w:cs="Segoe UI"/>
+                <w:b w:val="0"/>
+                <w:i w:val="0"/>
+                <w:color w:val="1C2B3A"/>
+                <w:sz w:val="19"/>
+              </w:rPr>
+              <w:t>localhost:5177</w:t>
+            </w:r>
+          </w:p>
+        </w:tc>
+        <w:tc>
+          <w:tcPr>
+            <w:tcW w:type="dxa" w:w="4252"/>
+          </w:tcPr>
+          <w:p>
+            <w:r>
+              <w:rPr>
+                <w:rFonts w:ascii="Segoe UI" w:hAnsi="Segoe UI" w:cs="Segoe UI"/>
+                <w:b w:val="0"/>
+                <w:i w:val="0"/>
+                <w:color w:val="1C2B3A"/>
+                <w:sz w:val="19"/>
+              </w:rPr>
+              <w:t>apps.p3mai.com/safe</w:t>
+            </w:r>
+          </w:p>
+        </w:tc>
+      </w:tr>
+      <w:tr>
+        <w:tc>
+          <w:tcPr>
+            <w:tcW w:type="dxa" w:w="2608"/>
+            <w:shd w:val="clear" w:fill="F3F6FA"/>
+          </w:tcPr>
+          <w:p>
+            <w:r>
+              <w:rPr>
+                <w:rFonts w:ascii="Segoe UI" w:hAnsi="Segoe UI" w:cs="Segoe UI"/>
+                <w:b w:val="0"/>
+                <w:i w:val="0"/>
+                <w:color w:val="1C2B3A"/>
+                <w:sz w:val="19"/>
+              </w:rPr>
+              <w:t>PMBOK Method Map</w:t>
+            </w:r>
+          </w:p>
+        </w:tc>
+        <w:tc>
+          <w:tcPr>
+            <w:tcW w:type="dxa" w:w="1928"/>
+            <w:shd w:val="clear" w:fill="F3F6FA"/>
+          </w:tcPr>
+          <w:p>
+            <w:r>
+              <w:rPr>
+                <w:rFonts w:ascii="Segoe UI" w:hAnsi="Segoe UI" w:cs="Segoe UI"/>
+                <w:b w:val="0"/>
+                <w:i w:val="0"/>
+                <w:color w:val="1C2B3A"/>
+                <w:sz w:val="19"/>
+              </w:rPr>
+              <w:t>localhost:5178</w:t>
+            </w:r>
+          </w:p>
+        </w:tc>
+        <w:tc>
+          <w:tcPr>
+            <w:tcW w:type="dxa" w:w="4252"/>
+            <w:shd w:val="clear" w:fill="F3F6FA"/>
+          </w:tcPr>
+          <w:p>
+            <w:r>
+              <w:rPr>
+                <w:rFonts w:ascii="Segoe UI" w:hAnsi="Segoe UI" w:cs="Segoe UI"/>
+                <w:b w:val="0"/>
+                <w:i w:val="0"/>
+                <w:color w:val="1C2B3A"/>
+                <w:sz w:val="19"/>
+              </w:rPr>
+              <w:t>apps.p3mai.com/pmbok</w:t>
             </w:r>
           </w:p>
         </w:tc>
@@ -2220,7 +2846,7 @@
                 <w:color w:val="1C2B3A"/>
                 <w:sz w:val="20"/>
               </w:rPr>
-              <w:t xml:space="preserve"> rewrites them to the live URLs in production. Replacing them with hardcoded URLs breaks local development.</w:t>
+              <w:t xml:space="preserve"> rewrites them in production. To change a target, edit the swap value in script.js, not the HTML.</w:t>
             </w:r>
           </w:p>
         </w:tc>
@@ -2236,7 +2862,7 @@
           <w:color w:val="1C2B3A"/>
           <w:sz w:val="22"/>
         </w:rPr>
-        <w:t xml:space="preserve">The cost estimator directs enquiries to </w:t>
+        <w:t xml:space="preserve">The </w:t>
       </w:r>
       <w:r>
         <w:rPr>
@@ -2246,7 +2872,7 @@
           <w:color w:val="1C2B3A"/>
           <w:sz w:val="22"/>
         </w:rPr>
-        <w:t>hello@P3MAI.com</w:t>
+        <w:t>contact pipeline</w:t>
       </w:r>
       <w:r>
         <w:rPr>
@@ -2256,7 +2882,27 @@
           <w:color w:val="1C2B3A"/>
           <w:sz w:val="22"/>
         </w:rPr>
-        <w:t>.</w:t>
+        <w:t xml:space="preserve"> is the site's one integration with the outside world: contact.php validates, drops honeypot-caught bots, guards against header injection, and mails the enquiry to </w:t>
+      </w:r>
+      <w:r>
+        <w:rPr>
+          <w:rFonts w:ascii="Segoe UI" w:hAnsi="Segoe UI" w:cs="Segoe UI"/>
+          <w:b/>
+          <w:i w:val="0"/>
+          <w:color w:val="1C2B3A"/>
+          <w:sz w:val="22"/>
+        </w:rPr>
+        <w:t>drcolvin@p3mai.com</w:t>
+      </w:r>
+      <w:r>
+        <w:rPr>
+          <w:rFonts w:ascii="Segoe UI" w:hAnsi="Segoe UI" w:cs="Segoe UI"/>
+          <w:b w:val="0"/>
+          <w:i w:val="0"/>
+          <w:color w:val="1C2B3A"/>
+          <w:sz w:val="22"/>
+        </w:rPr>
+        <w:t xml:space="preserve"> (From: noreply@p3mai.com for SPF; Reply-To: the visitor).</w:t>
       </w:r>
     </w:p>
     <w:p>
@@ -2326,7 +2972,7 @@
           <w:color w:val="5B6675"/>
           <w:sz w:val="18"/>
         </w:rPr>
-        <w:t>Figure 2 — Hosting: publish selected files by FTP into Rise's public_html.</w:t>
+        <w:t>Figure 2 — Hosting: Rise + StackCDN for the site; Render front door for the apps; contact.php mails the domain inbox.</w:t>
       </w:r>
     </w:p>
     <w:p/>
@@ -2359,7 +3005,47 @@
           <w:color w:val="1C2B3A"/>
           <w:sz w:val="22"/>
         </w:rPr>
-        <w:t xml:space="preserve"> (UK shared cPanel/FTP hosting). Publishing means uploading the approved static files into </w:t>
+        <w:t xml:space="preserve"> (UK shared cPanel/FTP) behind </w:t>
+      </w:r>
+      <w:r>
+        <w:rPr>
+          <w:rFonts w:ascii="Segoe UI" w:hAnsi="Segoe UI" w:cs="Segoe UI"/>
+          <w:b/>
+          <w:i w:val="0"/>
+          <w:color w:val="1C2B3A"/>
+          <w:sz w:val="22"/>
+        </w:rPr>
+        <w:t>StackCDN</w:t>
+      </w:r>
+      <w:r>
+        <w:rPr>
+          <w:rFonts w:ascii="Segoe UI" w:hAnsi="Segoe UI" w:cs="Segoe UI"/>
+          <w:b w:val="0"/>
+          <w:i w:val="0"/>
+          <w:color w:val="1C2B3A"/>
+          <w:sz w:val="22"/>
+        </w:rPr>
+        <w:t xml:space="preserve">, which caches static assets by exact URL — hence the </w:t>
+      </w:r>
+      <w:r>
+        <w:rPr>
+          <w:rFonts w:ascii="Consolas" w:hAnsi="Consolas" w:cs="Consolas"/>
+          <w:b w:val="0"/>
+          <w:i w:val="0"/>
+          <w:color w:val="1B3F6E"/>
+          <w:sz w:val="21"/>
+        </w:rPr>
+        <w:t>?v=N</w:t>
+      </w:r>
+      <w:r>
+        <w:rPr>
+          <w:rFonts w:ascii="Segoe UI" w:hAnsi="Segoe UI" w:cs="Segoe UI"/>
+          <w:b w:val="0"/>
+          <w:i w:val="0"/>
+          <w:color w:val="1C2B3A"/>
+          <w:sz w:val="22"/>
+        </w:rPr>
+        <w:t xml:space="preserve"> version strings on style.css and script.js. Publishing means uploading the approved files into </w:t>
       </w:r>
       <w:r>
         <w:rPr>
@@ -2379,7 +3065,7 @@
           <w:color w:val="1C2B3A"/>
           <w:sz w:val="22"/>
         </w:rPr>
-        <w:t xml:space="preserve">. The two apps live on Render under subdomains (app.p3mai.com, prince2.p3mai.com). Full publishing steps are in </w:t>
+        <w:t xml:space="preserve">. Full steps, the allow-list and the CDN discipline are in </w:t>
       </w:r>
       <w:r>
         <w:rPr>
@@ -2440,7 +3126,7 @@
                 <w:color w:val="1C2B3A"/>
                 <w:sz w:val="20"/>
               </w:rPr>
-              <w:t>Do not upload the entire project folder — it contains source assets, documents and memory that must never be public. See the Operation Manual for the exact allow-list.</w:t>
+              <w:t>Never upload the whole project folder — it contains source assets, documents and memory that must never be public. DOC-03 carries the exact allow-list.</w:t>
             </w:r>
           </w:p>
         </w:tc>
@@ -2525,7 +3211,7 @@
                 <w:color w:val="1C2B3A"/>
                 <w:sz w:val="19"/>
               </w:rPr>
-              <w:t>Static, no framework/build</w:t>
+              <w:t>Static + one PHP endpoint</w:t>
             </w:r>
           </w:p>
         </w:tc>
@@ -2542,7 +3228,7 @@
                 <w:color w:val="1C2B3A"/>
                 <w:sz w:val="19"/>
               </w:rPr>
-              <w:t>Fast, robust, trivially hostable on shared hosting.</w:t>
+              <w:t>Fast, robust, trivially hostable; email needs exactly one server-side file.</w:t>
             </w:r>
           </w:p>
         </w:tc>
@@ -2580,7 +3266,7 @@
                 <w:color w:val="1C2B3A"/>
                 <w:sz w:val="19"/>
               </w:rPr>
-              <w:t>One consistent shell; verify with a diff after edits.</w:t>
+              <w:t>One consistent shell; verified with a diff after edits.</w:t>
             </w:r>
           </w:p>
         </w:tc>
@@ -2616,7 +3302,81 @@
                 <w:color w:val="1C2B3A"/>
                 <w:sz w:val="19"/>
               </w:rPr>
-              <w:t>Cross-links work in both dev and prod with no manual editing.</w:t>
+              <w:t>Cross-links work in dev and prod with no manual editing.</w:t>
+            </w:r>
+          </w:p>
+        </w:tc>
+      </w:tr>
+      <w:tr>
+        <w:tc>
+          <w:tcPr>
+            <w:tcW w:type="dxa" w:w="2608"/>
+            <w:shd w:val="clear" w:fill="F3F6FA"/>
+          </w:tcPr>
+          <w:p>
+            <w:r>
+              <w:rPr>
+                <w:rFonts w:ascii="Segoe UI" w:hAnsi="Segoe UI" w:cs="Segoe UI"/>
+                <w:b w:val="0"/>
+                <w:i w:val="0"/>
+                <w:color w:val="1C2B3A"/>
+                <w:sz w:val="19"/>
+              </w:rPr>
+              <w:t>Context-carrying CTAs</w:t>
+            </w:r>
+          </w:p>
+        </w:tc>
+        <w:tc>
+          <w:tcPr>
+            <w:tcW w:type="dxa" w:w="6180"/>
+            <w:shd w:val="clear" w:fill="F3F6FA"/>
+          </w:tcPr>
+          <w:p>
+            <w:r>
+              <w:rPr>
+                <w:rFonts w:ascii="Segoe UI" w:hAnsi="Segoe UI" w:cs="Segoe UI"/>
+                <w:b w:val="0"/>
+                <w:i w:val="0"/>
+                <w:color w:val="1C2B3A"/>
+                <w:sz w:val="19"/>
+              </w:rPr>
+              <w:t>Every enquiry arrives naming the service (or the estimator basket) it came from.</w:t>
+            </w:r>
+          </w:p>
+        </w:tc>
+      </w:tr>
+      <w:tr>
+        <w:tc>
+          <w:tcPr>
+            <w:tcW w:type="dxa" w:w="2608"/>
+          </w:tcPr>
+          <w:p>
+            <w:r>
+              <w:rPr>
+                <w:rFonts w:ascii="Segoe UI" w:hAnsi="Segoe UI" w:cs="Segoe UI"/>
+                <w:b w:val="0"/>
+                <w:i w:val="0"/>
+                <w:color w:val="1C2B3A"/>
+                <w:sz w:val="19"/>
+              </w:rPr>
+              <w:t>Asset version strings (?v=N)</w:t>
+            </w:r>
+          </w:p>
+        </w:tc>
+        <w:tc>
+          <w:tcPr>
+            <w:tcW w:type="dxa" w:w="6180"/>
+          </w:tcPr>
+          <w:p>
+            <w:r>
+              <w:rPr>
+                <w:rFonts w:ascii="Segoe UI" w:hAnsi="Segoe UI" w:cs="Segoe UI"/>
+                <w:b w:val="0"/>
+                <w:i w:val="0"/>
+                <w:color w:val="1C2B3A"/>
+                <w:sz w:val="19"/>
+              </w:rPr>
+              <w:t>StackCDN caches by exact URL; bumping the string is the only reliable purge.</w:t>
             </w:r>
           </w:p>
         </w:tc>
@@ -2690,7 +3450,7 @@
                 <w:color w:val="1C2B3A"/>
                 <w:sz w:val="19"/>
               </w:rPr>
-              <w:t>Everything is grounded in the real CV — no fake testimonials or claims.</w:t>
+              <w:t>Everything grounded in the real CV; testimonials section stays dormant until real quotes exist.</w:t>
             </w:r>
           </w:p>
         </w:tc>
@@ -2735,7 +3495,7 @@
           <w:color w:val="1C2B3A"/>
           <w:sz w:val="22"/>
         </w:rPr>
-        <w:t xml:space="preserve"> — static files, minimal JS; fast to load.</w:t>
+        <w:t xml:space="preserve"> — static files behind a CDN; minimal JS.</w:t>
       </w:r>
     </w:p>
     <w:p>
@@ -2785,7 +3545,32 @@
           <w:color w:val="1C2B3A"/>
           <w:sz w:val="22"/>
         </w:rPr>
-        <w:t xml:space="preserve"> — per-page titles and meta descriptions.</w:t>
+        <w:t xml:space="preserve"> — per-page titles/meta descriptions; four full articles as the content layer.</w:t>
+      </w:r>
+    </w:p>
+    <w:p>
+      <w:pPr>
+        <w:pStyle w:val="ListBullet"/>
+      </w:pPr>
+      <w:r>
+        <w:rPr>
+          <w:rFonts w:ascii="Segoe UI" w:hAnsi="Segoe UI" w:cs="Segoe UI"/>
+          <w:b/>
+          <w:i w:val="0"/>
+          <w:color w:val="1C2B3A"/>
+          <w:sz w:val="22"/>
+        </w:rPr>
+        <w:t>Security</w:t>
+      </w:r>
+      <w:r>
+        <w:rPr>
+          <w:rFonts w:ascii="Segoe UI" w:hAnsi="Segoe UI" w:cs="Segoe UI"/>
+          <w:b w:val="0"/>
+          <w:i w:val="0"/>
+          <w:color w:val="1C2B3A"/>
+          <w:sz w:val="22"/>
+        </w:rPr>
+        <w:t xml:space="preserve"> — contact.php validates, caps lengths, strips CR/LF from headers, honeypots bots.</w:t>
       </w:r>
     </w:p>
     <w:p>
@@ -2810,7 +3595,7 @@
           <w:color w:val="1C2B3A"/>
           <w:sz w:val="22"/>
         </w:rPr>
-        <w:t xml:space="preserve"> — one file per page, one shared stylesheet and script.</w:t>
+        <w:t xml:space="preserve"> — one file per page, one stylesheet, one script, one PHP file.</w:t>
       </w:r>
     </w:p>
     <w:p>
@@ -2841,7 +3626,7 @@
           <w:color w:val="1C2B3A"/>
           <w:sz w:val="22"/>
         </w:rPr>
-        <w:t>Switch the Method Map link to the branded prince2.p3mai.com once DNS resolves.</w:t>
+        <w:t>Activate the dormant testimonials section once real attributed quotes exist (MKT-08).</w:t>
       </w:r>
     </w:p>
     <w:p>
@@ -2856,7 +3641,22 @@
           <w:color w:val="1C2B3A"/>
           <w:sz w:val="22"/>
         </w:rPr>
-        <w:t>Further blog content; optional analytics.</w:t>
+        <w:t>Pivot the primary CTA to the free delivery health check after testimonials (MKT-09).</w:t>
+      </w:r>
+    </w:p>
+    <w:p>
+      <w:pPr>
+        <w:pStyle w:val="ListBullet"/>
+      </w:pPr>
+      <w:r>
+        <w:rPr>
+          <w:rFonts w:ascii="Segoe UI" w:hAnsi="Segoe UI" w:cs="Segoe UI"/>
+          <w:b w:val="0"/>
+          <w:i w:val="0"/>
+          <w:color w:val="1C2B3A"/>
+          <w:sz w:val="22"/>
+        </w:rPr>
+        <w:t>Analytics + email capture (MKT-01/02) — the funnel currently runs unmeasured.</w:t>
       </w:r>
     </w:p>
     <w:p>
@@ -2916,7 +3716,7 @@
                 <w:color w:val="1B3F6E"/>
                 <w:sz w:val="18"/>
               </w:rPr>
-              <w:t xml:space="preserve">  index / about / services / blog / contact .html   the five pages</w:t>
+              <w:t xml:space="preserve">  index / about / services / blog / contact .html      core pages</w:t>
             </w:r>
           </w:p>
           <w:p>
@@ -2931,7 +3731,7 @@
                 <w:color w:val="1B3F6E"/>
                 <w:sz w:val="18"/>
               </w:rPr>
-              <w:t xml:space="preserve">  calculator.html      standalone cost estimator</w:t>
+              <w:t xml:space="preserve">  program-management / project-management /</w:t>
             </w:r>
           </w:p>
           <w:p>
@@ -2946,7 +3746,7 @@
                 <w:color w:val="1B3F6E"/>
                 <w:sz w:val="18"/>
               </w:rPr>
-              <w:t xml:space="preserve">  style.css            shared design system</w:t>
+              <w:t xml:space="preserve">    pmo-services .html                                 service detail pages</w:t>
             </w:r>
           </w:p>
           <w:p>
@@ -2961,7 +3761,7 @@
                 <w:color w:val="1B3F6E"/>
                 <w:sz w:val="18"/>
               </w:rPr>
-              <w:t xml:space="preserve">  script.js            shared interactions (env-aware links, etc.)</w:t>
+              <w:t xml:space="preserve">  building-web-apps-with-claude / ai-programs-need-a-pmo /</w:t>
             </w:r>
           </w:p>
           <w:p>
@@ -2976,7 +3776,7 @@
                 <w:color w:val="1B3F6E"/>
                 <w:sz w:val="18"/>
               </w:rPr>
-              <w:t xml:space="preserve">  logo/favicon SVGs, imagery</w:t>
+              <w:t xml:space="preserve">    scaling-ai-infrastructure / agentic-ai-in-the-pmo .html   articles</w:t>
             </w:r>
           </w:p>
           <w:p>
@@ -2991,7 +3791,82 @@
                 <w:color w:val="1B3F6E"/>
                 <w:sz w:val="18"/>
               </w:rPr>
-              <w:t xml:space="preserve">  docs/                this documentation set</w:t>
+              <w:t xml:space="preserve">  p3mai_services_cost_estimator.html                   THE services estimator</w:t>
+            </w:r>
+          </w:p>
+          <w:p>
+            <w:pPr>
+              <w:spacing w:after="0"/>
+            </w:pPr>
+            <w:r>
+              <w:rPr>
+                <w:rFonts w:ascii="Consolas" w:hAnsi="Consolas" w:cs="Consolas"/>
+                <w:b w:val="0"/>
+                <w:i w:val="0"/>
+                <w:color w:val="1B3F6E"/>
+                <w:sz w:val="18"/>
+              </w:rPr>
+              <w:t xml:space="preserve">  calculator.html                                      legacy estimator (unlinked)</w:t>
+            </w:r>
+          </w:p>
+          <w:p>
+            <w:pPr>
+              <w:spacing w:after="0"/>
+            </w:pPr>
+            <w:r>
+              <w:rPr>
+                <w:rFonts w:ascii="Consolas" w:hAnsi="Consolas" w:cs="Consolas"/>
+                <w:b w:val="0"/>
+                <w:i w:val="0"/>
+                <w:color w:val="1B3F6E"/>
+                <w:sz w:val="18"/>
+              </w:rPr>
+              <w:t xml:space="preserve">  contact.php                                          mail handler (the only PHP)</w:t>
+            </w:r>
+          </w:p>
+          <w:p>
+            <w:pPr>
+              <w:spacing w:after="0"/>
+            </w:pPr>
+            <w:r>
+              <w:rPr>
+                <w:rFonts w:ascii="Consolas" w:hAnsi="Consolas" w:cs="Consolas"/>
+                <w:b w:val="0"/>
+                <w:i w:val="0"/>
+                <w:color w:val="1B3F6E"/>
+                <w:sz w:val="18"/>
+              </w:rPr>
+              <w:t xml:space="preserve">  style.css / script.js                                design system + behaviour (?v=N)</w:t>
+            </w:r>
+          </w:p>
+          <w:p>
+            <w:pPr>
+              <w:spacing w:after="0"/>
+            </w:pPr>
+            <w:r>
+              <w:rPr>
+                <w:rFonts w:ascii="Consolas" w:hAnsi="Consolas" w:cs="Consolas"/>
+                <w:b w:val="0"/>
+                <w:i w:val="0"/>
+                <w:color w:val="1B3F6E"/>
+                <w:sz w:val="18"/>
+              </w:rPr>
+              <w:t xml:space="preserve">  logo/favicon SVGs, tile icons, blog thumbs, imagery</w:t>
+            </w:r>
+          </w:p>
+          <w:p>
+            <w:pPr>
+              <w:spacing w:after="0"/>
+            </w:pPr>
+            <w:r>
+              <w:rPr>
+                <w:rFonts w:ascii="Consolas" w:hAnsi="Consolas" w:cs="Consolas"/>
+                <w:b w:val="0"/>
+                <w:i w:val="0"/>
+                <w:color w:val="1B3F6E"/>
+                <w:sz w:val="18"/>
+              </w:rPr>
+              <w:t xml:space="preserve">  docs/                                                this documentation set</w:t>
             </w:r>
           </w:p>
         </w:tc>
@@ -3039,7 +3914,7 @@
         <w:sz w:val="16"/>
       </w:rPr>
       <w:tab/>
-      <w:t>v1.0</w:t>
+      <w:t>v2.0</w:t>
       <w:tab/>
     </w:r>
     <w:r>

</xml_diff>

<commit_message>
docs: fix Method Map leftovers in footer and title banner
docstyle.py's running footer and title-page banner still carried the
Method Map lineage text on this product's manuals. Regenerated.

Co-Authored-By: Claude Fable 5 <noreply@anthropic.com>
</commit_message>
<xml_diff>
--- a/docs/01_Architecture_and_Design.docx
+++ b/docs/01_Architecture_and_Design.docx
@@ -31,7 +31,7 @@
           <w:color w:val="A8841C"/>
           <w:sz w:val="28"/>
         </w:rPr>
-        <w:t>METHOD MAP</w:t>
+        <w:t>BUSINESS WEBSITE</w:t>
       </w:r>
     </w:p>
     <w:p/>
@@ -3903,7 +3903,7 @@
         <w:color w:val="5B6675"/>
         <w:sz w:val="16"/>
       </w:rPr>
-      <w:t>P3MAI Method Map</w:t>
+      <w:t>P3MAI Website</w:t>
     </w:r>
     <w:r>
       <w:rPr>

</xml_diff>